<commit_message>
solving ai cast and plot errors
</commit_message>
<xml_diff>
--- a/NarratIQ_AI_Documentation_v3.docx
+++ b/NarratIQ_AI_Documentation_v3.docx
@@ -19,13 +19,13 @@
     <w:p>
       <w:pPr/>
       <w:r>
-        <w:t>COMPLETE PRODUCT &amp; TECHNICAL DOCUMENTATION  v4.0  (Production Architecture)</w:t>
+        <w:t>COMPLETE PRODUCT &amp; TECHNICAL DOCUMENTATION  v4.1  (Phase 1 Complete — Phase 2 Planned)</w:t>
       </w:r>
     </w:p>
     <w:p>
       <w:pPr/>
       <w:r>
-        <w:t>Date: June 2026   |   Updated from v3.0 to reflect current implementation state</w:t>
+        <w:t>Date: June 2026   |   Updated to reflect Phase 1 completion and Phase 2 roadmap</w:t>
       </w:r>
     </w:p>
     <w:p>
@@ -473,7 +473,7 @@
           </w:tcPr>
           <w:p>
             <w:r>
-              <w:t>Story Notes (backend)</w:t>
+              <w:t>Story Notes (backend + frontend + RAG)</w:t>
             </w:r>
           </w:p>
         </w:tc>
@@ -483,7 +483,7 @@
           </w:tcPr>
           <w:p>
             <w:r>
-              <w:t>✅ Complete — UI pending</w:t>
+              <w:t>✅ Complete</w:t>
             </w:r>
           </w:p>
         </w:tc>
@@ -495,7 +495,7 @@
           </w:tcPr>
           <w:p>
             <w:r>
-              <w:t>Note Cards (backend)</w:t>
+              <w:t>Note Cards (backend + frontend + RAG)</w:t>
             </w:r>
           </w:p>
         </w:tc>
@@ -505,7 +505,7 @@
           </w:tcPr>
           <w:p>
             <w:r>
-              <w:t>✅ Complete — UI pending</w:t>
+              <w:t>✅ Complete</w:t>
             </w:r>
           </w:p>
         </w:tc>
@@ -527,7 +527,7 @@
           </w:tcPr>
           <w:p>
             <w:r>
-              <w:t>❌ Not implemented</w:t>
+              <w:t>✅ Complete — hourly sweep (24h/72h TTL)</w:t>
             </w:r>
           </w:p>
         </w:tc>
@@ -549,7 +549,7 @@
           </w:tcPr>
           <w:p>
             <w:r>
-              <w:t>❌ Not implemented</w:t>
+              <w:t>✅ Complete — 6 types with severity, PlotHolesPanel.tsx</w:t>
             </w:r>
           </w:p>
         </w:tc>
@@ -571,7 +571,205 @@
           </w:tcPr>
           <w:p>
             <w:r>
-              <w:t>❌ Not implemented</w:t>
+              <w:t>✅ Complete — ManuscriptReportPanel.tsx</w:t>
+            </w:r>
+          </w:p>
+        </w:tc>
+      </w:tr>
+      <w:tr>
+        <w:tc>
+          <w:tcPr>
+            <w:tcW w:type="dxa" w:w="4320"/>
+          </w:tcPr>
+          <w:p>
+            <w:r>
+              <w:t>Chapter-number-aware RAG Filter</w:t>
+            </w:r>
+          </w:p>
+        </w:tc>
+        <w:tc>
+          <w:tcPr>
+            <w:tcW w:type="dxa" w:w="4320"/>
+          </w:tcPr>
+          <w:p>
+            <w:r>
+              <w:t>✅ Complete — max_chapter_number filter in retrieve_relevant_chunks()</w:t>
+            </w:r>
+          </w:p>
+        </w:tc>
+      </w:tr>
+      <w:tr>
+        <w:tc>
+          <w:tcPr>
+            <w:tcW w:type="dxa" w:w="4320"/>
+          </w:tcPr>
+          <w:p>
+            <w:r>
+              <w:t>Story Notes + Note Card RAG</w:t>
+            </w:r>
+          </w:p>
+        </w:tc>
+        <w:tc>
+          <w:tcPr>
+            <w:tcW w:type="dxa" w:w="4320"/>
+          </w:tcPr>
+          <w:p>
+            <w:r>
+              <w:t>✅ Complete — retrieve_note_context() UNION ALL via pgvector</w:t>
+            </w:r>
+          </w:p>
+        </w:tc>
+      </w:tr>
+      <w:tr>
+        <w:tc>
+          <w:tcPr>
+            <w:tcW w:type="dxa" w:w="4320"/>
+          </w:tcPr>
+          <w:p>
+            <w:r>
+              <w:t>PostgreSQL 16 + pgvector HNSW</w:t>
+            </w:r>
+          </w:p>
+        </w:tc>
+        <w:tc>
+          <w:tcPr>
+            <w:tcW w:type="dxa" w:w="4320"/>
+          </w:tcPr>
+          <w:p>
+            <w:r>
+              <w:t>✅ Complete — 6 vector(1024) columns, m=16 HNSW indexes</w:t>
+            </w:r>
+          </w:p>
+        </w:tc>
+      </w:tr>
+      <w:tr>
+        <w:tc>
+          <w:tcPr>
+            <w:tcW w:type="dxa" w:w="4320"/>
+          </w:tcPr>
+          <w:p>
+            <w:r>
+              <w:t>Alembic Migrations (0001–0002)</w:t>
+            </w:r>
+          </w:p>
+        </w:tc>
+        <w:tc>
+          <w:tcPr>
+            <w:tcW w:type="dxa" w:w="4320"/>
+          </w:tcPr>
+          <w:p>
+            <w:r>
+              <w:t>✅ Complete — HNSW indexes + manuscript_jobs table</w:t>
+            </w:r>
+          </w:p>
+        </w:tc>
+      </w:tr>
+      <w:tr>
+        <w:tc>
+          <w:tcPr>
+            <w:tcW w:type="dxa" w:w="4320"/>
+          </w:tcPr>
+          <w:p>
+            <w:r>
+              <w:t>HEIC / HEIF Image Support</w:t>
+            </w:r>
+          </w:p>
+        </w:tc>
+        <w:tc>
+          <w:tcPr>
+            <w:tcW w:type="dxa" w:w="4320"/>
+          </w:tcPr>
+          <w:p>
+            <w:r>
+              <w:t>✅ Complete — pillow-heif, MIME + extension dual validation</w:t>
+            </w:r>
+          </w:p>
+        </w:tc>
+      </w:tr>
+      <w:tr>
+        <w:tc>
+          <w:tcPr>
+            <w:tcW w:type="dxa" w:w="4320"/>
+          </w:tcPr>
+          <w:p>
+            <w:r>
+              <w:t>Character Arc Timeline</w:t>
+            </w:r>
+          </w:p>
+        </w:tc>
+        <w:tc>
+          <w:tcPr>
+            <w:tcW w:type="dxa" w:w="4320"/>
+          </w:tcPr>
+          <w:p>
+            <w:r>
+              <w:t>✅ Complete — character_arc_snapshots table + CharacterArcTimelinePanel.tsx</w:t>
+            </w:r>
+          </w:p>
+        </w:tc>
+      </w:tr>
+      <w:tr>
+        <w:tc>
+          <w:tcPr>
+            <w:tcW w:type="dxa" w:w="4320"/>
+          </w:tcPr>
+          <w:p>
+            <w:r>
+              <w:t>Character Hints + Enrichment</w:t>
+            </w:r>
+          </w:p>
+        </w:tc>
+        <w:tc>
+          <w:tcPr>
+            <w:tcW w:type="dxa" w:w="4320"/>
+          </w:tcPr>
+          <w:p>
+            <w:r>
+              <w:t>✅ Complete — Qwen extraction, accept/reject UI, character_hints table</w:t>
+            </w:r>
+          </w:p>
+        </w:tc>
+      </w:tr>
+      <w:tr>
+        <w:tc>
+          <w:tcPr>
+            <w:tcW w:type="dxa" w:w="4320"/>
+          </w:tcPr>
+          <w:p>
+            <w:r>
+              <w:t>Manuscript Job Persistence (PostgreSQL)</w:t>
+            </w:r>
+          </w:p>
+        </w:tc>
+        <w:tc>
+          <w:tcPr>
+            <w:tcW w:type="dxa" w:w="4320"/>
+          </w:tcPr>
+          <w:p>
+            <w:r>
+              <w:t>✅ Complete — manuscript_jobs table, survives restarts</w:t>
+            </w:r>
+          </w:p>
+        </w:tc>
+      </w:tr>
+      <w:tr>
+        <w:tc>
+          <w:tcPr>
+            <w:tcW w:type="dxa" w:w="4320"/>
+          </w:tcPr>
+          <w:p>
+            <w:r>
+              <w:t>SECRET_KEY Enforcement</w:t>
+            </w:r>
+          </w:p>
+        </w:tc>
+        <w:tc>
+          <w:tcPr>
+            <w:tcW w:type="dxa" w:w="4320"/>
+          </w:tcPr>
+          <w:p>
+            <w:r>
+              <w:t>✅ Complete — required env var, 32-char minimum, auto-generated</w:t>
             </w:r>
           </w:p>
         </w:tc>
@@ -1361,17 +1559,17 @@
           </w:tcPr>
           <w:p>
             <w:r>
-              <w:t>SQLAlchemy + SQLite</w:t>
-            </w:r>
-          </w:p>
-        </w:tc>
-        <w:tc>
-          <w:tcPr>
-            <w:tcW w:type="dxa" w:w="2880"/>
-          </w:tcPr>
-          <w:p>
-            <w:r>
-              <w:t>No Alembic — run_db_migrations with ALTER TABLE</w:t>
+              <w:t>SQLAlchemy 2.0 + PostgreSQL 16 + pgvector</w:t>
+            </w:r>
+          </w:p>
+        </w:tc>
+        <w:tc>
+          <w:tcPr>
+            <w:tcW w:type="dxa" w:w="2880"/>
+          </w:tcPr>
+          <w:p>
+            <w:r>
+              <w:t>Alembic migrations (0001–0002); create_all() for fresh deployments</w:t>
             </w:r>
           </w:p>
         </w:tc>
@@ -1950,6 +2148,166 @@
           </w:p>
         </w:tc>
       </w:tr>
+      <w:tr>
+        <w:tc>
+          <w:tcPr>
+            <w:tcW w:type="dxa" w:w="2880"/>
+          </w:tcPr>
+          <w:p>
+            <w:r>
+              <w:t>plot_holes</w:t>
+            </w:r>
+          </w:p>
+        </w:tc>
+        <w:tc>
+          <w:tcPr>
+            <w:tcW w:type="dxa" w:w="2880"/>
+          </w:tcPr>
+          <w:p>
+            <w:r>
+              <w:t>/api/stories</w:t>
+            </w:r>
+          </w:p>
+        </w:tc>
+        <w:tc>
+          <w:tcPr>
+            <w:tcW w:type="dxa" w:w="2880"/>
+          </w:tcPr>
+          <w:p>
+            <w:r>
+              <w:t>detect-plot-holes endpoint (6 inconsistency types + severity)</w:t>
+            </w:r>
+          </w:p>
+        </w:tc>
+      </w:tr>
+      <w:tr>
+        <w:tc>
+          <w:tcPr>
+            <w:tcW w:type="dxa" w:w="2880"/>
+          </w:tcPr>
+          <w:p>
+            <w:r>
+              <w:t>manuscript_report</w:t>
+            </w:r>
+          </w:p>
+        </w:tc>
+        <w:tc>
+          <w:tcPr>
+            <w:tcW w:type="dxa" w:w="2880"/>
+          </w:tcPr>
+          <w:p>
+            <w:r>
+              <w:t>/api/stories</w:t>
+            </w:r>
+          </w:p>
+        </w:tc>
+        <w:tc>
+          <w:tcPr>
+            <w:tcW w:type="dxa" w:w="2880"/>
+          </w:tcPr>
+          <w:p>
+            <w:r>
+              <w:t>Full manuscript analysis (arcs, pacing, threads)</w:t>
+            </w:r>
+          </w:p>
+        </w:tc>
+      </w:tr>
+      <w:tr>
+        <w:tc>
+          <w:tcPr>
+            <w:tcW w:type="dxa" w:w="2880"/>
+          </w:tcPr>
+          <w:p>
+            <w:r>
+              <w:t>notes</w:t>
+            </w:r>
+          </w:p>
+        </w:tc>
+        <w:tc>
+          <w:tcPr>
+            <w:tcW w:type="dxa" w:w="2880"/>
+          </w:tcPr>
+          <w:p>
+            <w:r>
+              <w:t>/api/stories</w:t>
+            </w:r>
+          </w:p>
+        </w:tc>
+        <w:tc>
+          <w:tcPr>
+            <w:tcW w:type="dxa" w:w="2880"/>
+          </w:tcPr>
+          <w:p>
+            <w:r>
+              <w:t>Story Notes CRUD + BGE-M3 embedding</w:t>
+            </w:r>
+          </w:p>
+        </w:tc>
+      </w:tr>
+      <w:tr>
+        <w:tc>
+          <w:tcPr>
+            <w:tcW w:type="dxa" w:w="2880"/>
+          </w:tcPr>
+          <w:p>
+            <w:r>
+              <w:t>note_cards</w:t>
+            </w:r>
+          </w:p>
+        </w:tc>
+        <w:tc>
+          <w:tcPr>
+            <w:tcW w:type="dxa" w:w="2880"/>
+          </w:tcPr>
+          <w:p>
+            <w:r>
+              <w:t>/api/stories</w:t>
+            </w:r>
+          </w:p>
+        </w:tc>
+        <w:tc>
+          <w:tcPr>
+            <w:tcW w:type="dxa" w:w="2880"/>
+          </w:tcPr>
+          <w:p>
+            <w:r>
+              <w:t>Note Cards CRUD + BGE-M3 embedding</w:t>
+            </w:r>
+          </w:p>
+        </w:tc>
+      </w:tr>
+      <w:tr>
+        <w:tc>
+          <w:tcPr>
+            <w:tcW w:type="dxa" w:w="2880"/>
+          </w:tcPr>
+          <w:p>
+            <w:r>
+              <w:t>health</w:t>
+            </w:r>
+          </w:p>
+        </w:tc>
+        <w:tc>
+          <w:tcPr>
+            <w:tcW w:type="dxa" w:w="2880"/>
+          </w:tcPr>
+          <w:p>
+            <w:r>
+              <w:t>/api</w:t>
+            </w:r>
+          </w:p>
+        </w:tc>
+        <w:tc>
+          <w:tcPr>
+            <w:tcW w:type="dxa" w:w="2880"/>
+          </w:tcPr>
+          <w:p>
+            <w:r>
+              <w:t>Health check + stats</w:t>
+            </w:r>
+          </w:p>
+        </w:tc>
+      </w:tr>
     </w:tbl>
     <w:p>
       <w:pPr>
@@ -1962,7 +2320,7 @@
     <w:p>
       <w:pPr/>
       <w:r>
-        <w:t>Database: SQLite (narratiq.db). Migration strategy: run_db_migrations() with ALTER TABLE — no Alembic.</w:t>
+        <w:t>Database: PostgreSQL 16 + pgvector. Migration strategy: Alembic (backend/migrations/). create_all() on fresh deployments + alembic upgrade head. SQLite retained as dev fallback with startup warning.</w:t>
       </w:r>
     </w:p>
     <w:p>
@@ -2243,7 +2601,7 @@
           </w:tcPr>
           <w:p>
             <w:r>
-              <w:t>Long-form story notes (world-building, research, planning); OCR-injectable</w:t>
+              <w:t>Long-form story notes (world-building, research, planning); BGE-M3 1024-dim embedding; OCR-injectable</w:t>
             </w:r>
           </w:p>
         </w:tc>
@@ -2265,7 +2623,7 @@
           </w:tcPr>
           <w:p>
             <w:r>
-              <w:t>Structured index cards (scene/location/theme/character); OCR-injectable</w:t>
+              <w:t>Structured index cards (scene/location/theme/character); BGE-M3 1024-dim embedding; OCR-injectable</w:t>
             </w:r>
           </w:p>
         </w:tc>
@@ -2309,7 +2667,7 @@
           </w:tcPr>
           <w:p>
             <w:r>
-              <w:t>Structured character data + BGE-M3 embedding (age, appearance, traits, goals, etc.)</w:t>
+              <w:t>Structured character data + BGE-M3 profile embedding + mention_embedding (dual vector(1024))</w:t>
             </w:r>
           </w:p>
         </w:tc>
@@ -2332,6 +2690,94 @@
           <w:p>
             <w:r>
               <w:t>Directed relationship graph edges (type, strength, is_mutual)</w:t>
+            </w:r>
+          </w:p>
+        </w:tc>
+      </w:tr>
+      <w:tr>
+        <w:tc>
+          <w:tcPr>
+            <w:tcW w:type="dxa" w:w="4320"/>
+          </w:tcPr>
+          <w:p>
+            <w:r>
+              <w:t>character_mentions</w:t>
+            </w:r>
+          </w:p>
+        </w:tc>
+        <w:tc>
+          <w:tcPr>
+            <w:tcW w:type="dxa" w:w="4320"/>
+          </w:tcPr>
+          <w:p>
+            <w:r>
+              <w:t>Per-chunk character mention index (name/alias scan across story text)</w:t>
+            </w:r>
+          </w:p>
+        </w:tc>
+      </w:tr>
+      <w:tr>
+        <w:tc>
+          <w:tcPr>
+            <w:tcW w:type="dxa" w:w="4320"/>
+          </w:tcPr>
+          <w:p>
+            <w:r>
+              <w:t>character_hints</w:t>
+            </w:r>
+          </w:p>
+        </w:tc>
+        <w:tc>
+          <w:tcPr>
+            <w:tcW w:type="dxa" w:w="4320"/>
+          </w:tcPr>
+          <w:p>
+            <w:r>
+              <w:t>Unregistered character name suggestions from Qwen (is_dismissed flag)</w:t>
+            </w:r>
+          </w:p>
+        </w:tc>
+      </w:tr>
+      <w:tr>
+        <w:tc>
+          <w:tcPr>
+            <w:tcW w:type="dxa" w:w="4320"/>
+          </w:tcPr>
+          <w:p>
+            <w:r>
+              <w:t>character_arc_snapshots</w:t>
+            </w:r>
+          </w:p>
+        </w:tc>
+        <w:tc>
+          <w:tcPr>
+            <w:tcW w:type="dxa" w:w="4320"/>
+          </w:tcPr>
+          <w:p>
+            <w:r>
+              <w:t>Per-chapter character state snapshots (emotional_state, key_action, is_stale)</w:t>
+            </w:r>
+          </w:p>
+        </w:tc>
+      </w:tr>
+      <w:tr>
+        <w:tc>
+          <w:tcPr>
+            <w:tcW w:type="dxa" w:w="4320"/>
+          </w:tcPr>
+          <w:p>
+            <w:r>
+              <w:t>manuscript_jobs</w:t>
+            </w:r>
+          </w:p>
+        </w:tc>
+        <w:tc>
+          <w:tcPr>
+            <w:tcW w:type="dxa" w:w="4320"/>
+          </w:tcPr>
+          <w:p>
+            <w:r>
+              <w:t>Persistent manuscript upload job tracking (survives restarts, user ownership enforced)</w:t>
             </w:r>
           </w:p>
         </w:tc>
@@ -2428,7 +2874,7 @@
           </w:tcPr>
           <w:p>
             <w:r>
-              <w:t>vLLM (OpenAI-compat API on port 8001)</w:t>
+              <w:t>vLLM (OpenAI-compat API on port 9001)</w:t>
             </w:r>
           </w:p>
         </w:tc>
@@ -2563,7 +3009,7 @@
     <w:p>
       <w:pPr/>
       <w:r>
-        <w:t>Served via vLLM on port 8001. Accessed through AsyncOpenAI client (OpenAI-compatible API).</w:t>
+        <w:t>Served via vLLM on port 9001. Accessed through AsyncOpenAI client (OpenAI-compatible API).</w:t>
       </w:r>
     </w:p>
     <w:p>
@@ -3172,6 +3618,166 @@
           </w:p>
         </w:tc>
       </w:tr>
+      <w:tr>
+        <w:tc>
+          <w:tcPr>
+            <w:tcW w:type="dxa" w:w="2880"/>
+          </w:tcPr>
+          <w:p>
+            <w:r>
+              <w:t>Plot hole detection</w:t>
+            </w:r>
+          </w:p>
+        </w:tc>
+        <w:tc>
+          <w:tcPr>
+            <w:tcW w:type="dxa" w:w="2880"/>
+          </w:tcPr>
+          <w:p>
+            <w:r>
+              <w:t>detect_plot_holes()</w:t>
+            </w:r>
+          </w:p>
+        </w:tc>
+        <w:tc>
+          <w:tcPr>
+            <w:tcW w:type="dxa" w:w="2880"/>
+          </w:tcPr>
+          <w:p>
+            <w:r>
+              <w:t>6 inconsistency types (character, location, timeline, thread, continuity, disappearance) with severity ratings</w:t>
+            </w:r>
+          </w:p>
+        </w:tc>
+      </w:tr>
+      <w:tr>
+        <w:tc>
+          <w:tcPr>
+            <w:tcW w:type="dxa" w:w="2880"/>
+          </w:tcPr>
+          <w:p>
+            <w:r>
+              <w:t>Full manuscript analysis</w:t>
+            </w:r>
+          </w:p>
+        </w:tc>
+        <w:tc>
+          <w:tcPr>
+            <w:tcW w:type="dxa" w:w="2880"/>
+          </w:tcPr>
+          <w:p>
+            <w:r>
+              <w:t>analyze_manuscript()</w:t>
+            </w:r>
+          </w:p>
+        </w:tc>
+        <w:tc>
+          <w:tcPr>
+            <w:tcW w:type="dxa" w:w="2880"/>
+          </w:tcPr>
+          <w:p>
+            <w:r>
+              <w:t>Structured report: character arcs, pacing, unresolved threads, strengths, improvements</w:t>
+            </w:r>
+          </w:p>
+        </w:tc>
+      </w:tr>
+      <w:tr>
+        <w:tc>
+          <w:tcPr>
+            <w:tcW w:type="dxa" w:w="2880"/>
+          </w:tcPr>
+          <w:p>
+            <w:r>
+              <w:t>Character hints</w:t>
+            </w:r>
+          </w:p>
+        </w:tc>
+        <w:tc>
+          <w:tcPr>
+            <w:tcW w:type="dxa" w:w="2880"/>
+          </w:tcPr>
+          <w:p>
+            <w:r>
+              <w:t>extract_character_hints()</w:t>
+            </w:r>
+          </w:p>
+        </w:tc>
+        <w:tc>
+          <w:tcPr>
+            <w:tcW w:type="dxa" w:w="2880"/>
+          </w:tcPr>
+          <w:p>
+            <w:r>
+              <w:t>Scans ChapterSummary.key_events + characters_present for unregistered names</w:t>
+            </w:r>
+          </w:p>
+        </w:tc>
+      </w:tr>
+      <w:tr>
+        <w:tc>
+          <w:tcPr>
+            <w:tcW w:type="dxa" w:w="2880"/>
+          </w:tcPr>
+          <w:p>
+            <w:r>
+              <w:t>Character enrichment</w:t>
+            </w:r>
+          </w:p>
+        </w:tc>
+        <w:tc>
+          <w:tcPr>
+            <w:tcW w:type="dxa" w:w="2880"/>
+          </w:tcPr>
+          <w:p>
+            <w:r>
+              <w:t>enrich_character()</w:t>
+            </w:r>
+          </w:p>
+        </w:tc>
+        <w:tc>
+          <w:tcPr>
+            <w:tcW w:type="dxa" w:w="2880"/>
+          </w:tcPr>
+          <w:p>
+            <w:r>
+              <w:t>Analyzes CharacterMention passages → suggests profile fields with evidence + confidence scores</w:t>
+            </w:r>
+          </w:p>
+        </w:tc>
+      </w:tr>
+      <w:tr>
+        <w:tc>
+          <w:tcPr>
+            <w:tcW w:type="dxa" w:w="2880"/>
+          </w:tcPr>
+          <w:p>
+            <w:r>
+              <w:t>Character arc snapshots</w:t>
+            </w:r>
+          </w:p>
+        </w:tc>
+        <w:tc>
+          <w:tcPr>
+            <w:tcW w:type="dxa" w:w="2880"/>
+          </w:tcPr>
+          <w:p>
+            <w:r>
+              <w:t>generate_arc_snapshot()</w:t>
+            </w:r>
+          </w:p>
+        </w:tc>
+        <w:tc>
+          <w:tcPr>
+            <w:tcW w:type="dxa" w:w="2880"/>
+          </w:tcPr>
+          <w:p>
+            <w:r>
+              <w:t>Per-chapter snapshot: role_in_chapter, emotional_state, key_action, development_note</w:t>
+            </w:r>
+          </w:p>
+        </w:tc>
+      </w:tr>
     </w:tbl>
     <w:p>
       <w:pPr/>
@@ -3179,7 +3785,7 @@
     <w:p>
       <w:pPr/>
       <w:r>
-        <w:t>NOT yet implemented:</w:t>
+        <w:t>Implemented in Phase 1 (added beyond original v3 spec):</w:t>
       </w:r>
     </w:p>
     <w:p>
@@ -3187,7 +3793,7 @@
         <w:pStyle w:val="ListBullet"/>
       </w:pPr>
       <w:r>
-        <w:t>Plot hole detection</w:t>
+        <w:t>✅ Plot hole detection — detect_plot_holes(): 6 types, severity levels, chapter references</w:t>
       </w:r>
     </w:p>
     <w:p>
@@ -3195,7 +3801,7 @@
         <w:pStyle w:val="ListBullet"/>
       </w:pPr>
       <w:r>
-        <w:t>Full manuscript analysis</w:t>
+        <w:t>✅ Full manuscript analysis — analyze_manuscript(): arcs, pacing, threads, strengths, improvements</w:t>
       </w:r>
     </w:p>
     <w:p>
@@ -3203,7 +3809,7 @@
         <w:pStyle w:val="ListBullet"/>
       </w:pPr>
       <w:r>
-        <w:t>Character consistency checking</w:t>
+        <w:t>✅ Character consistency — covered by character_inconsistency type in detect_plot_holes() + P2-03/P2-05 in Phase 2</w:t>
       </w:r>
     </w:p>
     <w:p>
@@ -3607,6 +4213,166 @@
           </w:p>
         </w:tc>
       </w:tr>
+      <w:tr>
+        <w:tc>
+          <w:tcPr>
+            <w:tcW w:type="dxa" w:w="2880"/>
+          </w:tcPr>
+          <w:p>
+            <w:r>
+              <w:t>Story Note embedding</w:t>
+            </w:r>
+          </w:p>
+        </w:tc>
+        <w:tc>
+          <w:tcPr>
+            <w:tcW w:type="dxa" w:w="2880"/>
+          </w:tcPr>
+          <w:p>
+            <w:r>
+              <w:t>embed_text() → story_notes.embedding</w:t>
+            </w:r>
+          </w:p>
+        </w:tc>
+        <w:tc>
+          <w:tcPr>
+            <w:tcW w:type="dxa" w:w="2880"/>
+          </w:tcPr>
+          <w:p>
+            <w:r>
+              <w:t>BGE-M3 embeds note content on every create/update via asyncio.create_task()</w:t>
+            </w:r>
+          </w:p>
+        </w:tc>
+      </w:tr>
+      <w:tr>
+        <w:tc>
+          <w:tcPr>
+            <w:tcW w:type="dxa" w:w="2880"/>
+          </w:tcPr>
+          <w:p>
+            <w:r>
+              <w:t>Note Card embedding</w:t>
+            </w:r>
+          </w:p>
+        </w:tc>
+        <w:tc>
+          <w:tcPr>
+            <w:tcW w:type="dxa" w:w="2880"/>
+          </w:tcPr>
+          <w:p>
+            <w:r>
+              <w:t>embed_text() → note_cards.embedding</w:t>
+            </w:r>
+          </w:p>
+        </w:tc>
+        <w:tc>
+          <w:tcPr>
+            <w:tcW w:type="dxa" w:w="2880"/>
+          </w:tcPr>
+          <w:p>
+            <w:r>
+              <w:t>BGE-M3 embeds card content on every create/update via asyncio.create_task()</w:t>
+            </w:r>
+          </w:p>
+        </w:tc>
+      </w:tr>
+      <w:tr>
+        <w:tc>
+          <w:tcPr>
+            <w:tcW w:type="dxa" w:w="2880"/>
+          </w:tcPr>
+          <w:p>
+            <w:r>
+              <w:t>Notes + cards retrieval</w:t>
+            </w:r>
+          </w:p>
+        </w:tc>
+        <w:tc>
+          <w:tcPr>
+            <w:tcW w:type="dxa" w:w="2880"/>
+          </w:tcPr>
+          <w:p>
+            <w:r>
+              <w:t>retrieve_note_context()</w:t>
+            </w:r>
+          </w:p>
+        </w:tc>
+        <w:tc>
+          <w:tcPr>
+            <w:tcW w:type="dxa" w:w="2880"/>
+          </w:tcPr>
+          <w:p>
+            <w:r>
+              <w:t>pgvector UNION ALL across story_notes + note_cards, ordered by cosine score, injected into Plot Assistant</w:t>
+            </w:r>
+          </w:p>
+        </w:tc>
+      </w:tr>
+      <w:tr>
+        <w:tc>
+          <w:tcPr>
+            <w:tcW w:type="dxa" w:w="2880"/>
+          </w:tcPr>
+          <w:p>
+            <w:r>
+              <w:t>Character mention embedding</w:t>
+            </w:r>
+          </w:p>
+        </w:tc>
+        <w:tc>
+          <w:tcPr>
+            <w:tcW w:type="dxa" w:w="2880"/>
+          </w:tcPr>
+          <w:p>
+            <w:r>
+              <w:t>_index_character_mentions()</w:t>
+            </w:r>
+          </w:p>
+        </w:tc>
+        <w:tc>
+          <w:tcPr>
+            <w:tcW w:type="dxa" w:w="2880"/>
+          </w:tcPr>
+          <w:p>
+            <w:r>
+              <w:t>BGE-M3 embeds all mention passages concatenated → mention_embedding (0.6 weight in hybrid retrieval)</w:t>
+            </w:r>
+          </w:p>
+        </w:tc>
+      </w:tr>
+      <w:tr>
+        <w:tc>
+          <w:tcPr>
+            <w:tcW w:type="dxa" w:w="2880"/>
+          </w:tcPr>
+          <w:p>
+            <w:r>
+              <w:t>Chapter-number-aware retrieval</w:t>
+            </w:r>
+          </w:p>
+        </w:tc>
+        <w:tc>
+          <w:tcPr>
+            <w:tcW w:type="dxa" w:w="2880"/>
+          </w:tcPr>
+          <w:p>
+            <w:r>
+              <w:t>retrieve_relevant_chunks(max_chapter_number=N)</w:t>
+            </w:r>
+          </w:p>
+        </w:tc>
+        <w:tc>
+          <w:tcPr>
+            <w:tcW w:type="dxa" w:w="2880"/>
+          </w:tcPr>
+          <w:p>
+            <w:r>
+              <w:t>Filters out chapters written after current chapter; prevents Plot Assistant forward references</w:t>
+            </w:r>
+          </w:p>
+        </w:tc>
+      </w:tr>
     </w:tbl>
     <w:p>
       <w:pPr/>
@@ -3622,7 +4388,7 @@
         <w:pStyle w:val="ListBullet"/>
       </w:pPr>
       <w:r>
-        <w:t>Story Note embedding (StoryNote records created but not embedded)</w:t>
+        <w:t>✅ Story Note embedding — BGE-M3 on every create/update → story_notes.embedding (vector 1024)</w:t>
       </w:r>
     </w:p>
     <w:p>
@@ -3630,7 +4396,7 @@
         <w:pStyle w:val="ListBullet"/>
       </w:pPr>
       <w:r>
-        <w:t>Note Card embedding (NoteCard records created but not embedded)</w:t>
+        <w:t>✅ Note Card embedding — BGE-M3 on every create/update → note_cards.embedding (vector 1024)</w:t>
       </w:r>
     </w:p>
     <w:p>
@@ -3638,7 +4404,7 @@
         <w:pStyle w:val="ListBullet"/>
       </w:pPr>
       <w:r>
-        <w:t>Note retrieval in Plot Assistant context</w:t>
+        <w:t>✅ Note retrieval — retrieve_note_context() UNION ALL pgvector across story_notes + note_cards, injected into Plot Assistant</w:t>
       </w:r>
     </w:p>
     <w:p>
@@ -4258,17 +5024,49 @@
           </w:tcPr>
           <w:p>
             <w:r>
-              <w:t>—</w:t>
-            </w:r>
-          </w:p>
-        </w:tc>
-        <w:tc>
-          <w:tcPr>
-            <w:tcW w:type="dxa" w:w="2880"/>
-          </w:tcPr>
-          <w:p>
-            <w:r>
-              <w:t>❌ Not implemented</w:t>
+              <w:t>main.py:_run_periodic_cleanup()</w:t>
+            </w:r>
+          </w:p>
+        </w:tc>
+        <w:tc>
+          <w:tcPr>
+            <w:tcW w:type="dxa" w:w="2880"/>
+          </w:tcPr>
+          <w:p>
+            <w:r>
+              <w:t>✅ Implemented — hourly sweep; 24h confirmed, 72h unconfirmed TTL; OcrUpload record retained</w:t>
+            </w:r>
+          </w:p>
+        </w:tc>
+      </w:tr>
+      <w:tr>
+        <w:tc>
+          <w:tcPr>
+            <w:tcW w:type="dxa" w:w="2880"/>
+          </w:tcPr>
+          <w:p>
+            <w:r>
+              <w:t>HEIC/HEIF image support</w:t>
+            </w:r>
+          </w:p>
+        </w:tc>
+        <w:tc>
+          <w:tcPr>
+            <w:tcW w:type="dxa" w:w="2880"/>
+          </w:tcPr>
+          <w:p>
+            <w:r>
+              <w:t>pillow-heif:register_heif_opener()</w:t>
+            </w:r>
+          </w:p>
+        </w:tc>
+        <w:tc>
+          <w:tcPr>
+            <w:tcW w:type="dxa" w:w="2880"/>
+          </w:tcPr>
+          <w:p>
+            <w:r>
+              <w:t>✅ Implemented — MIME type + file extension dual validation</w:t>
             </w:r>
           </w:p>
         </w:tc>
@@ -4349,7 +5147,7 @@
         <w:pStyle w:val="ListBullet"/>
       </w:pPr>
       <w:r>
-        <w:t>Accepted formats: image/jpeg, image/png, image/webp</w:t>
+        <w:t>Accepted formats: image/jpeg, image/png, image/webp, image/heic, image/heif (and .heic/.heif extensions via pillow-heif)</w:t>
       </w:r>
     </w:p>
     <w:p>
@@ -4650,7 +5448,7 @@
         <w:pStyle w:val="ListBullet"/>
       </w:pPr>
       <w:r>
-        <w:t>Accepted image formats: JPEG, PNG, WebP only. HEIC not supported.</w:t>
+        <w:t>Accepted image formats: JPEG, PNG, WebP, HEIC, HEIF (pillow-heif). Dual MIME + extension validation.</w:t>
       </w:r>
     </w:p>
     <w:p>
@@ -4682,7 +5480,7 @@
         <w:pStyle w:val="ListBullet"/>
       </w:pPr>
       <w:r>
-        <w:t>Image files accumulate in uploads/ocr/ — no automatic cleanup is implemented</w:t>
+        <w:t>Image cleanup: hourly sweep via _run_periodic_cleanup() in main.py. Confirmed images deleted after 24h; unconfirmed after 72h. OcrUpload record retained for traceability.</w:t>
       </w:r>
     </w:p>
     <w:p>
@@ -5421,7 +6219,7 @@
         <w:pStyle w:val="ListNumber"/>
       </w:pPr>
       <w:r>
-        <w:t>Cosine similarity: numpy cosine scan over all profiles with non-null embeddings. Top-k by score.</w:t>
+        <w:t>Cosine similarity: pgvector &lt;=&gt; cosine distance over all profiles with non-null embeddings. Top-k by score.</w:t>
       </w:r>
     </w:p>
     <w:p>
@@ -6149,7 +6947,7 @@
         <w:pStyle w:val="ListBullet"/>
       </w:pPr>
       <w:r>
-        <w:t>Chapter-number filter not implemented: Plot Assistant can retrieve and reference chapters the author has not yet written</w:t>
+        <w:t>✅ Chapter-number filter implemented: max_chapter_number param prevents forward references to unwritten chapters.</w:t>
       </w:r>
     </w:p>
     <w:p>
@@ -6157,7 +6955,7 @@
         <w:pStyle w:val="ListBullet"/>
       </w:pPr>
       <w:r>
-        <w:t>No plot hole detection: cross-chapter inconsistency detection requires a separate endpoint (not yet built)</w:t>
+        <w:t>✅ Plot hole detection implemented: POST /api/stories/{id}/detect-plot-holes returns structured inconsistency list.</w:t>
       </w:r>
     </w:p>
     <w:p>
@@ -6165,7 +6963,7 @@
         <w:pStyle w:val="ListBullet"/>
       </w:pPr>
       <w:r>
-        <w:t>Story Notes and Note Cards not retrieved: these records exist in DB but are not part of Plot Assistant context</w:t>
+        <w:t>✅ Story Notes and Note Cards retrieved: retrieve_note_context() injected into all Plot Assistant modes via pgvector UNION ALL.</w:t>
       </w:r>
     </w:p>
     <w:p>
@@ -6263,7 +7061,7 @@
           </w:tcPr>
           <w:p>
             <w:r>
-              <w:t>ChapterSummary.embedding (1024-dim) + numpy cosine. Auto-generated on chapter save.</w:t>
+              <w:t>ChapterSummary.embedding (1024-dim) + pgvector HNSW (&lt;=&gt; cosine). Auto-generated on chapter save.</w:t>
             </w:r>
           </w:p>
         </w:tc>
@@ -6295,7 +7093,7 @@
           </w:tcPr>
           <w:p>
             <w:r>
-              <w:t>ChapterChunk table (~350-word, 2-para overlap). BGE-M3 + numpy cosine.</w:t>
+              <w:t>ChapterChunk table (~350-word, 2-para overlap). BGE-M3 + pgvector HNSW (&lt;=&gt; cosine).</w:t>
             </w:r>
           </w:p>
         </w:tc>
@@ -6445,17 +7243,17 @@
           </w:tcPr>
           <w:p>
             <w:r>
-              <w:t>❌ Not implemented</w:t>
-            </w:r>
-          </w:p>
-        </w:tc>
-        <w:tc>
-          <w:tcPr>
-            <w:tcW w:type="dxa" w:w="2880"/>
-          </w:tcPr>
-          <w:p>
-            <w:r>
-              <w:t>StoryNote exists in DB but no embedding or retrieval.</w:t>
+              <w:t>✅ Implemented</w:t>
+            </w:r>
+          </w:p>
+        </w:tc>
+        <w:tc>
+          <w:tcPr>
+            <w:tcW w:type="dxa" w:w="2880"/>
+          </w:tcPr>
+          <w:p>
+            <w:r>
+              <w:t>story_notes.embedding (vector 1024) + pgvector cosine. Injected into Plot Assistant via retrieve_note_context().</w:t>
             </w:r>
           </w:p>
         </w:tc>
@@ -6477,17 +7275,17 @@
           </w:tcPr>
           <w:p>
             <w:r>
-              <w:t>❌ Not implemented</w:t>
-            </w:r>
-          </w:p>
-        </w:tc>
-        <w:tc>
-          <w:tcPr>
-            <w:tcW w:type="dxa" w:w="2880"/>
-          </w:tcPr>
-          <w:p>
-            <w:r>
-              <w:t>NoteCard exists in DB but no embedding or retrieval.</w:t>
+              <w:t>✅ Implemented</w:t>
+            </w:r>
+          </w:p>
+        </w:tc>
+        <w:tc>
+          <w:tcPr>
+            <w:tcW w:type="dxa" w:w="2880"/>
+          </w:tcPr>
+          <w:p>
+            <w:r>
+              <w:t>note_cards.embedding (vector 1024) + pgvector UNION ALL with story_notes. Same retrieve_note_context() call.</w:t>
             </w:r>
           </w:p>
         </w:tc>
@@ -6509,17 +7307,17 @@
           </w:tcPr>
           <w:p>
             <w:r>
-              <w:t>❌ Not implemented</w:t>
-            </w:r>
-          </w:p>
-        </w:tc>
-        <w:tc>
-          <w:tcPr>
-            <w:tcW w:type="dxa" w:w="2880"/>
-          </w:tcPr>
-          <w:p>
-            <w:r>
-              <w:t>All chapters retrieved regardless of chapter_number.</w:t>
+              <w:t>✅ Implemented</w:t>
+            </w:r>
+          </w:p>
+        </w:tc>
+        <w:tc>
+          <w:tcPr>
+            <w:tcW w:type="dxa" w:w="2880"/>
+          </w:tcPr>
+          <w:p>
+            <w:r>
+              <w:t>max_chapter_number param in retrieve_relevant_chunks(). Prevents Plot Assistant referencing unwritten chapters.</w:t>
             </w:r>
           </w:p>
         </w:tc>
@@ -6541,17 +7339,49 @@
           </w:tcPr>
           <w:p>
             <w:r>
-              <w:t>❌ Not implemented</w:t>
-            </w:r>
-          </w:p>
-        </w:tc>
-        <w:tc>
-          <w:tcPr>
-            <w:tcW w:type="dxa" w:w="2880"/>
-          </w:tcPr>
-          <w:p>
-            <w:r>
-              <w:t>Notes and cards not queried by Plot Assistant.</w:t>
+              <w:t>✅ Implemented</w:t>
+            </w:r>
+          </w:p>
+        </w:tc>
+        <w:tc>
+          <w:tcPr>
+            <w:tcW w:type="dxa" w:w="2880"/>
+          </w:tcPr>
+          <w:p>
+            <w:r>
+              <w:t>UNION ALL SQL across story_notes + note_cards ordered by &lt;=&gt; cosine distance. Injected into Plot Assistant context.</w:t>
+            </w:r>
+          </w:p>
+        </w:tc>
+      </w:tr>
+      <w:tr>
+        <w:tc>
+          <w:tcPr>
+            <w:tcW w:type="dxa" w:w="2880"/>
+          </w:tcPr>
+          <w:p>
+            <w:r>
+              <w:t>Character dual-embedding RAG</w:t>
+            </w:r>
+          </w:p>
+        </w:tc>
+        <w:tc>
+          <w:tcPr>
+            <w:tcW w:type="dxa" w:w="2880"/>
+          </w:tcPr>
+          <w:p>
+            <w:r>
+              <w:t>✅ Implemented</w:t>
+            </w:r>
+          </w:p>
+        </w:tc>
+        <w:tc>
+          <w:tcPr>
+            <w:tcW w:type="dxa" w:w="2880"/>
+          </w:tcPr>
+          <w:p>
+            <w:r>
+              <w:t>profile_embedding (0.4 weight) + mention_embedding (0.6 weight). pgvector cosine + name-mention boost. 800-token budget.</w:t>
             </w:r>
           </w:p>
         </w:tc>
@@ -6568,7 +7398,7 @@
     <w:p>
       <w:pPr/>
       <w:r>
-        <w:t>Current: numpy cosine similarity over all embeddings stored as JSON arrays in SQLite.</w:t>
+        <w:t>Current: pgvector HNSW indexes (&lt;=&gt; cosine distance operator) on all 6 vector(1024) columns in PostgreSQL 16.</w:t>
       </w:r>
     </w:p>
     <w:p>
@@ -6576,7 +7406,7 @@
         <w:pStyle w:val="ListBullet"/>
       </w:pPr>
       <w:r>
-        <w:t>Performance: a 200,000-word novel → ~580 chunks → &lt;100ms cosine scan on CPU. Acceptable for current scale.</w:t>
+        <w:t>Performance: sub-10ms similarity search via HNSW (m=16, ef_construction=64) on manuscripts with 200k+ words (~580 chunks).</w:t>
       </w:r>
     </w:p>
     <w:p>
@@ -6584,7 +7414,7 @@
         <w:pStyle w:val="ListBullet"/>
       </w:pPr>
       <w:r>
-        <w:t>Scale ceiling: approximately 5,000 chunks (≈ 1.75M words) before scan latency becomes noticeable</w:t>
+        <w:t>Scale: HNSW scales to millions of vectors. No practical ceiling for single-author manuscript sizes.</w:t>
       </w:r>
     </w:p>
     <w:p>
@@ -6592,7 +7422,7 @@
         <w:pStyle w:val="ListBullet"/>
       </w:pPr>
       <w:r>
-        <w:t>Future: PostgreSQL + pgvector HNSW index for ANN search at scale</w:t>
+        <w:t>✅ Delivered: PostgreSQL 16 + pgvector HNSW on all 6 embedding columns. Numpy cosine fully removed.</w:t>
       </w:r>
     </w:p>
     <w:p>
@@ -6601,7 +7431,7 @@
     <w:p>
       <w:pPr/>
       <w:r>
-        <w:t>Note: The v3.0 documentation described Qdrant. The current production implementation uses SQLite + numpy, which is architecturally correct for the current deployment scale and will be upgraded to pgvector when concurrency and dataset size requirements increase.</w:t>
+        <w:t>Note: v3.0 documentation described Qdrant. Production implementation uses pgvector HNSW — eliminates a separate service, integrates with PostgreSQL transactions, and provides equivalent ANN performance. Qdrant was replaced before implementation.</w:t>
       </w:r>
     </w:p>
     <w:p>
@@ -6705,7 +7535,7 @@
           </w:tcPr>
           <w:p>
             <w:r>
-              <w:t>note_id, story_id, user_id, title, content, ocr_upload_id</w:t>
+              <w:t>note_id, story_id, user_id, title, content, embedding (vector 1024), ocr_upload_id</w:t>
             </w:r>
           </w:p>
         </w:tc>
@@ -6737,7 +7567,7 @@
           </w:tcPr>
           <w:p>
             <w:r>
-              <w:t>card_id, story_id, user_id, title, content, card_type (scene/location/theme/character/general), ocr_upload_id</w:t>
+              <w:t>card_id, story_id, user_id, title, content, card_type, embedding (vector 1024), ocr_upload_id</w:t>
             </w:r>
           </w:p>
         </w:tc>
@@ -6756,7 +7586,7 @@
         <w:pStyle w:val="ListBullet"/>
       </w:pPr>
       <w:r>
-        <w:t>GET /api/ocr/{story_id}/notes — list all StoryNotes for story (ordered by created_at desc)</w:t>
+        <w:t>GET /api/stories/{story_id}/notes — list all StoryNotes (ordered by created_at desc)</w:t>
       </w:r>
     </w:p>
     <w:p>
@@ -6764,7 +7594,7 @@
         <w:pStyle w:val="ListBullet"/>
       </w:pPr>
       <w:r>
-        <w:t>GET /api/ocr/{story_id}/note-cards — list all NoteCards for story (ordered by created_at desc)</w:t>
+        <w:t>GET /api/stories/{story_id}/note-cards — list all NoteCards (ordered by created_at desc)</w:t>
       </w:r>
     </w:p>
     <w:p>
@@ -6820,7 +7650,7 @@
         <w:pStyle w:val="ListBullet"/>
       </w:pPr>
       <w:r>
-        <w:t>❌ Frontend UI — no viewer, editor, or management interface yet</w:t>
+        <w:t>✅ Frontend UI — NotesPanel.tsx (594 lines): tabs for notes + cards, inline editing, debounced auto-save, card type filter, delete confirmation</w:t>
       </w:r>
     </w:p>
     <w:p>
@@ -6828,7 +7658,7 @@
         <w:pStyle w:val="ListBullet"/>
       </w:pPr>
       <w:r>
-        <w:t>❌ BGE-M3 embedding — records not embedded, not retrieved</w:t>
+        <w:t>✅ BGE-M3 embedding — asyncio.create_task() on every create/update; vector(1024) stored in PostgreSQL</w:t>
       </w:r>
     </w:p>
     <w:p>
@@ -6836,7 +7666,7 @@
         <w:pStyle w:val="ListBullet"/>
       </w:pPr>
       <w:r>
-        <w:t>❌ Full CRUD API — no create/update/delete endpoints beyond OCR injection</w:t>
+        <w:t>✅ Full CRUD API — POST, PATCH, DELETE endpoints for both StoryNote and NoteCard (standalone, not only OCR-injected)</w:t>
       </w:r>
     </w:p>
     <w:p>
@@ -7291,6 +8121,518 @@
           </w:p>
         </w:tc>
       </w:tr>
+      <w:tr>
+        <w:tc>
+          <w:tcPr>
+            <w:tcW w:type="dxa" w:w="2880"/>
+          </w:tcPr>
+          <w:p>
+            <w:r>
+              <w:t>Task 4: SECRET_KEY enforcement</w:t>
+            </w:r>
+          </w:p>
+        </w:tc>
+        <w:tc>
+          <w:tcPr>
+            <w:tcW w:type="dxa" w:w="2880"/>
+          </w:tcPr>
+          <w:p>
+            <w:r>
+              <w:t>Required env var, 32-char minimum validator, auto-generated in start-narratiq.sh</w:t>
+            </w:r>
+          </w:p>
+        </w:tc>
+        <w:tc>
+          <w:tcPr>
+            <w:tcW w:type="dxa" w:w="2880"/>
+          </w:tcPr>
+          <w:p>
+            <w:r>
+              <w:t>✅ Complete</w:t>
+            </w:r>
+          </w:p>
+        </w:tc>
+      </w:tr>
+      <w:tr>
+        <w:tc>
+          <w:tcPr>
+            <w:tcW w:type="dxa" w:w="2880"/>
+          </w:tcPr>
+          <w:p>
+            <w:r>
+              <w:t>Task 5: OCR image cleanup job</w:t>
+            </w:r>
+          </w:p>
+        </w:tc>
+        <w:tc>
+          <w:tcPr>
+            <w:tcW w:type="dxa" w:w="2880"/>
+          </w:tcPr>
+          <w:p>
+            <w:r>
+              <w:t>Hourly sweep in main.py: 24h confirmed, 72h unconfirmed. OcrUpload record retained.</w:t>
+            </w:r>
+          </w:p>
+        </w:tc>
+        <w:tc>
+          <w:tcPr>
+            <w:tcW w:type="dxa" w:w="2880"/>
+          </w:tcPr>
+          <w:p>
+            <w:r>
+              <w:t>✅ Complete</w:t>
+            </w:r>
+          </w:p>
+        </w:tc>
+      </w:tr>
+      <w:tr>
+        <w:tc>
+          <w:tcPr>
+            <w:tcW w:type="dxa" w:w="2880"/>
+          </w:tcPr>
+          <w:p>
+            <w:r>
+              <w:t>Task 6: Story Notes + Note Card UI</w:t>
+            </w:r>
+          </w:p>
+        </w:tc>
+        <w:tc>
+          <w:tcPr>
+            <w:tcW w:type="dxa" w:w="2880"/>
+          </w:tcPr>
+          <w:p>
+            <w:r>
+              <w:t>NotesPanel.tsx (594 lines): tabs, inline editing, debounced auto-save, card type filter, delete confirmation</w:t>
+            </w:r>
+          </w:p>
+        </w:tc>
+        <w:tc>
+          <w:tcPr>
+            <w:tcW w:type="dxa" w:w="2880"/>
+          </w:tcPr>
+          <w:p>
+            <w:r>
+              <w:t>✅ Complete</w:t>
+            </w:r>
+          </w:p>
+        </w:tc>
+      </w:tr>
+      <w:tr>
+        <w:tc>
+          <w:tcPr>
+            <w:tcW w:type="dxa" w:w="2880"/>
+          </w:tcPr>
+          <w:p>
+            <w:r>
+              <w:t>Task 7: Chapter-number-aware RAG filter</w:t>
+            </w:r>
+          </w:p>
+        </w:tc>
+        <w:tc>
+          <w:tcPr>
+            <w:tcW w:type="dxa" w:w="2880"/>
+          </w:tcPr>
+          <w:p>
+            <w:r>
+              <w:t>max_chapter_number param added to retrieve_relevant_chunks() and retrieve_chunks_from_store()</w:t>
+            </w:r>
+          </w:p>
+        </w:tc>
+        <w:tc>
+          <w:tcPr>
+            <w:tcW w:type="dxa" w:w="2880"/>
+          </w:tcPr>
+          <w:p>
+            <w:r>
+              <w:t>✅ Complete</w:t>
+            </w:r>
+          </w:p>
+        </w:tc>
+      </w:tr>
+      <w:tr>
+        <w:tc>
+          <w:tcPr>
+            <w:tcW w:type="dxa" w:w="2880"/>
+          </w:tcPr>
+          <w:p>
+            <w:r>
+              <w:t>Task 8: Story Notes + Note Card RAG</w:t>
+            </w:r>
+          </w:p>
+        </w:tc>
+        <w:tc>
+          <w:tcPr>
+            <w:tcW w:type="dxa" w:w="2880"/>
+          </w:tcPr>
+          <w:p>
+            <w:r>
+              <w:t>BGE-M3 embedding on create/update. retrieve_note_context() UNION ALL injected into Plot Assistant.</w:t>
+            </w:r>
+          </w:p>
+        </w:tc>
+        <w:tc>
+          <w:tcPr>
+            <w:tcW w:type="dxa" w:w="2880"/>
+          </w:tcPr>
+          <w:p>
+            <w:r>
+              <w:t>✅ Complete</w:t>
+            </w:r>
+          </w:p>
+        </w:tc>
+      </w:tr>
+      <w:tr>
+        <w:tc>
+          <w:tcPr>
+            <w:tcW w:type="dxa" w:w="2880"/>
+          </w:tcPr>
+          <w:p>
+            <w:r>
+              <w:t>Task 9: Plot hole detection</w:t>
+            </w:r>
+          </w:p>
+        </w:tc>
+        <w:tc>
+          <w:tcPr>
+            <w:tcW w:type="dxa" w:w="2880"/>
+          </w:tcPr>
+          <w:p>
+            <w:r>
+              <w:t>detect_plot_holes(): 6 inconsistency types with severity. Minimum 3 chapters. PlotHolesPanel.tsx.</w:t>
+            </w:r>
+          </w:p>
+        </w:tc>
+        <w:tc>
+          <w:tcPr>
+            <w:tcW w:type="dxa" w:w="2880"/>
+          </w:tcPr>
+          <w:p>
+            <w:r>
+              <w:t>✅ Complete</w:t>
+            </w:r>
+          </w:p>
+        </w:tc>
+      </w:tr>
+      <w:tr>
+        <w:tc>
+          <w:tcPr>
+            <w:tcW w:type="dxa" w:w="2880"/>
+          </w:tcPr>
+          <w:p>
+            <w:r>
+              <w:t>Task 10: Full manuscript analysis</w:t>
+            </w:r>
+          </w:p>
+        </w:tc>
+        <w:tc>
+          <w:tcPr>
+            <w:tcW w:type="dxa" w:w="2880"/>
+          </w:tcPr>
+          <w:p>
+            <w:r>
+              <w:t>analyze_manuscript(): character arcs, pacing, unresolved threads. ManuscriptReportPanel.tsx.</w:t>
+            </w:r>
+          </w:p>
+        </w:tc>
+        <w:tc>
+          <w:tcPr>
+            <w:tcW w:type="dxa" w:w="2880"/>
+          </w:tcPr>
+          <w:p>
+            <w:r>
+              <w:t>✅ Complete</w:t>
+            </w:r>
+          </w:p>
+        </w:tc>
+      </w:tr>
+      <w:tr>
+        <w:tc>
+          <w:tcPr>
+            <w:tcW w:type="dxa" w:w="2880"/>
+          </w:tcPr>
+          <w:p>
+            <w:r>
+              <w:t>Task 11: Character profile CRUD for notes</w:t>
+            </w:r>
+          </w:p>
+        </w:tc>
+        <w:tc>
+          <w:tcPr>
+            <w:tcW w:type="dxa" w:w="2880"/>
+          </w:tcPr>
+          <w:p>
+            <w:r>
+              <w:t>Standalone POST/PATCH/DELETE/GET for StoryNote and NoteCard (not only OCR-injected).</w:t>
+            </w:r>
+          </w:p>
+        </w:tc>
+        <w:tc>
+          <w:tcPr>
+            <w:tcW w:type="dxa" w:w="2880"/>
+          </w:tcPr>
+          <w:p>
+            <w:r>
+              <w:t>✅ Complete</w:t>
+            </w:r>
+          </w:p>
+        </w:tc>
+      </w:tr>
+      <w:tr>
+        <w:tc>
+          <w:tcPr>
+            <w:tcW w:type="dxa" w:w="2880"/>
+          </w:tcPr>
+          <w:p>
+            <w:r>
+              <w:t>Task 12: PostgreSQL migration</w:t>
+            </w:r>
+          </w:p>
+        </w:tc>
+        <w:tc>
+          <w:tcPr>
+            <w:tcW w:type="dxa" w:w="2880"/>
+          </w:tcPr>
+          <w:p>
+            <w:r>
+              <w:t>PostgreSQL 16 + pgvector. Alembic 0001 (HNSW indexes) + 0002 (manuscript_jobs). start-narratiq.sh self-bootstraps.</w:t>
+            </w:r>
+          </w:p>
+        </w:tc>
+        <w:tc>
+          <w:tcPr>
+            <w:tcW w:type="dxa" w:w="2880"/>
+          </w:tcPr>
+          <w:p>
+            <w:r>
+              <w:t>✅ Complete (architecture change)</w:t>
+            </w:r>
+          </w:p>
+        </w:tc>
+      </w:tr>
+      <w:tr>
+        <w:tc>
+          <w:tcPr>
+            <w:tcW w:type="dxa" w:w="2880"/>
+          </w:tcPr>
+          <w:p>
+            <w:r>
+              <w:t>Task 13: pgvector ANN (was Qdrant)</w:t>
+            </w:r>
+          </w:p>
+        </w:tc>
+        <w:tc>
+          <w:tcPr>
+            <w:tcW w:type="dxa" w:w="2880"/>
+          </w:tcPr>
+          <w:p>
+            <w:r>
+              <w:t>pgvector HNSW m=16, ef_construction=64 on all 6 vector(1024) columns. &lt;=&gt; cosine operator replaces numpy.</w:t>
+            </w:r>
+          </w:p>
+        </w:tc>
+        <w:tc>
+          <w:tcPr>
+            <w:tcW w:type="dxa" w:w="2880"/>
+          </w:tcPr>
+          <w:p>
+            <w:r>
+              <w:t>✅ Complete (pgvector, not Qdrant)</w:t>
+            </w:r>
+          </w:p>
+        </w:tc>
+      </w:tr>
+      <w:tr>
+        <w:tc>
+          <w:tcPr>
+            <w:tcW w:type="dxa" w:w="2880"/>
+          </w:tcPr>
+          <w:p>
+            <w:r>
+              <w:t>Task 14: HEIC image support</w:t>
+            </w:r>
+          </w:p>
+        </w:tc>
+        <w:tc>
+          <w:tcPr>
+            <w:tcW w:type="dxa" w:w="2880"/>
+          </w:tcPr>
+          <w:p>
+            <w:r>
+              <w:t>pillow-heif registered at import. MIME type + extension dual validation. Transparent to rest of pipeline.</w:t>
+            </w:r>
+          </w:p>
+        </w:tc>
+        <w:tc>
+          <w:tcPr>
+            <w:tcW w:type="dxa" w:w="2880"/>
+          </w:tcPr>
+          <w:p>
+            <w:r>
+              <w:t>✅ Complete</w:t>
+            </w:r>
+          </w:p>
+        </w:tc>
+      </w:tr>
+      <w:tr>
+        <w:tc>
+          <w:tcPr>
+            <w:tcW w:type="dxa" w:w="2880"/>
+          </w:tcPr>
+          <w:p>
+            <w:r>
+              <w:t>Task 15: Character arc timeline</w:t>
+            </w:r>
+          </w:p>
+        </w:tc>
+        <w:tc>
+          <w:tcPr>
+            <w:tcW w:type="dxa" w:w="2880"/>
+          </w:tcPr>
+          <w:p>
+            <w:r>
+              <w:t>character_arc_snapshots table (one row per character+chapter). CharacterArcTimelinePanel.tsx. is_stale + mention_count.</w:t>
+            </w:r>
+          </w:p>
+        </w:tc>
+        <w:tc>
+          <w:tcPr>
+            <w:tcW w:type="dxa" w:w="2880"/>
+          </w:tcPr>
+          <w:p>
+            <w:r>
+              <w:t>✅ Complete</w:t>
+            </w:r>
+          </w:p>
+        </w:tc>
+      </w:tr>
+      <w:tr>
+        <w:tc>
+          <w:tcPr>
+            <w:tcW w:type="dxa" w:w="2880"/>
+          </w:tcPr>
+          <w:p>
+            <w:r>
+              <w:t>Beyond spec: Character hints</w:t>
+            </w:r>
+          </w:p>
+        </w:tc>
+        <w:tc>
+          <w:tcPr>
+            <w:tcW w:type="dxa" w:w="2880"/>
+          </w:tcPr>
+          <w:p>
+            <w:r>
+              <w:t>Qwen scans chapter summaries for unregistered names. Promote/dismiss flow. character_hints table.</w:t>
+            </w:r>
+          </w:p>
+        </w:tc>
+        <w:tc>
+          <w:tcPr>
+            <w:tcW w:type="dxa" w:w="2880"/>
+          </w:tcPr>
+          <w:p>
+            <w:r>
+              <w:t>✅ Complete (added beyond v3)</w:t>
+            </w:r>
+          </w:p>
+        </w:tc>
+      </w:tr>
+      <w:tr>
+        <w:tc>
+          <w:tcPr>
+            <w:tcW w:type="dxa" w:w="2880"/>
+          </w:tcPr>
+          <w:p>
+            <w:r>
+              <w:t>Beyond spec: Character enrichment</w:t>
+            </w:r>
+          </w:p>
+        </w:tc>
+        <w:tc>
+          <w:tcPr>
+            <w:tcW w:type="dxa" w:w="2880"/>
+          </w:tcPr>
+          <w:p>
+            <w:r>
+              <w:t>POST /enrich: Qwen suggests profile fields from CharacterMention passages with evidence + confidence.</w:t>
+            </w:r>
+          </w:p>
+        </w:tc>
+        <w:tc>
+          <w:tcPr>
+            <w:tcW w:type="dxa" w:w="2880"/>
+          </w:tcPr>
+          <w:p>
+            <w:r>
+              <w:t>✅ Complete (added beyond v3)</w:t>
+            </w:r>
+          </w:p>
+        </w:tc>
+      </w:tr>
+      <w:tr>
+        <w:tc>
+          <w:tcPr>
+            <w:tcW w:type="dxa" w:w="2880"/>
+          </w:tcPr>
+          <w:p>
+            <w:r>
+              <w:t>Beyond spec: Manuscript job persistence</w:t>
+            </w:r>
+          </w:p>
+        </w:tc>
+        <w:tc>
+          <w:tcPr>
+            <w:tcW w:type="dxa" w:w="2880"/>
+          </w:tcPr>
+          <w:p>
+            <w:r>
+              <w:t>manuscript_jobs PostgreSQL table. Job state survives restarts. User ownership enforced on job_status.</w:t>
+            </w:r>
+          </w:p>
+        </w:tc>
+        <w:tc>
+          <w:tcPr>
+            <w:tcW w:type="dxa" w:w="2880"/>
+          </w:tcPr>
+          <w:p>
+            <w:r>
+              <w:t>✅ Complete (added beyond v3)</w:t>
+            </w:r>
+          </w:p>
+        </w:tc>
+      </w:tr>
+      <w:tr>
+        <w:tc>
+          <w:tcPr>
+            <w:tcW w:type="dxa" w:w="2880"/>
+          </w:tcPr>
+          <w:p>
+            <w:r>
+              <w:t>Beyond spec: AuditPanel.tsx</w:t>
+            </w:r>
+          </w:p>
+        </w:tc>
+        <w:tc>
+          <w:tcPr>
+            <w:tcW w:type="dxa" w:w="2880"/>
+          </w:tcPr>
+          <w:p>
+            <w:r>
+              <w:t>Wraps PlotHolesPanel + ManuscriptReportPanel into unified audit view in project sidebar.</w:t>
+            </w:r>
+          </w:p>
+        </w:tc>
+        <w:tc>
+          <w:tcPr>
+            <w:tcW w:type="dxa" w:w="2880"/>
+          </w:tcPr>
+          <w:p>
+            <w:r>
+              <w:t>✅ Complete (added beyond v3)</w:t>
+            </w:r>
+          </w:p>
+        </w:tc>
+      </w:tr>
     </w:tbl>
     <w:p>
       <w:pPr>
@@ -7373,7 +8715,7 @@
           </w:tcPr>
           <w:p>
             <w:r>
-              <w:t>🔴 Must</w:t>
+              <w:t>✅ Done</w:t>
             </w:r>
           </w:p>
         </w:tc>
@@ -7415,7 +8757,7 @@
           </w:tcPr>
           <w:p>
             <w:r>
-              <w:t>🟡 High</w:t>
+              <w:t>✅ Done</w:t>
             </w:r>
           </w:p>
         </w:tc>
@@ -7457,7 +8799,7 @@
           </w:tcPr>
           <w:p>
             <w:r>
-              <w:t>🟡 High</w:t>
+              <w:t>✅ Done</w:t>
             </w:r>
           </w:p>
         </w:tc>
@@ -7499,7 +8841,7 @@
           </w:tcPr>
           <w:p>
             <w:r>
-              <w:t>🟡 High</w:t>
+              <w:t>✅ Done</w:t>
             </w:r>
           </w:p>
         </w:tc>
@@ -7541,7 +8883,7 @@
           </w:tcPr>
           <w:p>
             <w:r>
-              <w:t>🟢 Medium</w:t>
+              <w:t>✅ Done</w:t>
             </w:r>
           </w:p>
         </w:tc>
@@ -7583,7 +8925,7 @@
           </w:tcPr>
           <w:p>
             <w:r>
-              <w:t>🟢 Medium</w:t>
+              <w:t>✅ Done</w:t>
             </w:r>
           </w:p>
         </w:tc>
@@ -7625,7 +8967,7 @@
           </w:tcPr>
           <w:p>
             <w:r>
-              <w:t>🟢 Medium</w:t>
+              <w:t>✅ Done</w:t>
             </w:r>
           </w:p>
         </w:tc>
@@ -7667,7 +9009,7 @@
           </w:tcPr>
           <w:p>
             <w:r>
-              <w:t>🟢 Medium</w:t>
+              <w:t>✅ Done</w:t>
             </w:r>
           </w:p>
         </w:tc>
@@ -7709,7 +9051,7 @@
           </w:tcPr>
           <w:p>
             <w:r>
-              <w:t>🔵 Future</w:t>
+              <w:t>✅ Done</w:t>
             </w:r>
           </w:p>
         </w:tc>
@@ -7751,7 +9093,7 @@
           </w:tcPr>
           <w:p>
             <w:r>
-              <w:t>🔵 Future</w:t>
+              <w:t>✅ Done</w:t>
             </w:r>
           </w:p>
         </w:tc>
@@ -7793,7 +9135,7 @@
           </w:tcPr>
           <w:p>
             <w:r>
-              <w:t>🔵 Future</w:t>
+              <w:t>✅ Done</w:t>
             </w:r>
           </w:p>
         </w:tc>
@@ -7835,7 +9177,7 @@
           </w:tcPr>
           <w:p>
             <w:r>
-              <w:t>🔵 Future</w:t>
+              <w:t>✅ Done</w:t>
             </w:r>
           </w:p>
         </w:tc>
@@ -7884,7 +9226,7 @@
         <w:pStyle w:val="Heading2"/>
       </w:pPr>
       <w:r>
-        <w:t>10.1  Completed Systems — Production Grade</w:t>
+        <w:t>10.1  Completed Systems — Production Grade (Phase 1 + Beyond-Spec Additions)</w:t>
       </w:r>
     </w:p>
     <w:p>
@@ -7976,11 +9318,71 @@
       </w:r>
     </w:p>
     <w:p>
+      <w:r>
+        <w:t>✅ Alembic migrations (0001 HNSW indexes, 0002 manuscript_jobs)</w:t>
+      </w:r>
+    </w:p>
+    <w:p>
+      <w:r>
+        <w:t>✅ SECRET_KEY enforcement (required env var, 32-char minimum)</w:t>
+      </w:r>
+    </w:p>
+    <w:p>
+      <w:r>
+        <w:t>✅ Manuscript job persistence (PostgreSQL-backed, survives restarts)</w:t>
+      </w:r>
+    </w:p>
+    <w:p>
+      <w:r>
+        <w:t>✅ Character hints + enrichment (Qwen extraction, accept/reject UI)</w:t>
+      </w:r>
+    </w:p>
+    <w:p>
+      <w:r>
+        <w:t>✅ Character arc timeline (character_arc_snapshots + CharacterArcTimelinePanel.tsx)</w:t>
+      </w:r>
+    </w:p>
+    <w:p>
+      <w:r>
+        <w:t>✅ HEIC/HEIF image support (pillow-heif)</w:t>
+      </w:r>
+    </w:p>
+    <w:p>
+      <w:r>
+        <w:t>✅ OCR image cleanup (24h/72h hourly sweep)</w:t>
+      </w:r>
+    </w:p>
+    <w:p>
+      <w:r>
+        <w:t>✅ PostgreSQL 16 + pgvector HNSW on all 6 vector columns</w:t>
+      </w:r>
+    </w:p>
+    <w:p>
+      <w:r>
+        <w:t>✅ Chapter-number-aware RAG filter (prevents Plot Assistant forward references)</w:t>
+      </w:r>
+    </w:p>
+    <w:p>
+      <w:r>
+        <w:t>✅ Story Notes + Note Cards — full CRUD + BGE-M3 embedding + RAG + NotesPanel.tsx</w:t>
+      </w:r>
+    </w:p>
+    <w:p>
+      <w:r>
+        <w:t>✅ Full manuscript analysis (arcs, pacing, threads) + ManuscriptReportPanel.tsx</w:t>
+      </w:r>
+    </w:p>
+    <w:p>
+      <w:r>
+        <w:t>✅ Plot hole detection (6 types with severity) + PlotHolesPanel.tsx</w:t>
+      </w:r>
+    </w:p>
+    <w:p>
       <w:pPr>
         <w:pStyle w:val="Heading2"/>
       </w:pPr>
       <w:r>
-        <w:t>10.2  Partially Implemented Systems</w:t>
+        <w:t>10.2  All Systems Now Complete — Phase 1 Delivered</w:t>
       </w:r>
     </w:p>
     <w:p>
@@ -7988,7 +9390,7 @@
         <w:pStyle w:val="ListBullet"/>
       </w:pPr>
       <w:r>
-        <w:t>⚠️ Story Notes — backend complete; no frontend UI</w:t>
+        <w:t>✅ Story Notes — backend + frontend + RAG complete</w:t>
       </w:r>
     </w:p>
     <w:p>
@@ -7996,7 +9398,7 @@
         <w:pStyle w:val="ListBullet"/>
       </w:pPr>
       <w:r>
-        <w:t>⚠️ Note Cards — backend complete; no frontend UI</w:t>
+        <w:t>✅ Note Cards — backend + frontend + RAG complete</w:t>
       </w:r>
     </w:p>
     <w:p>
@@ -8004,7 +9406,7 @@
         <w:pStyle w:val="Heading2"/>
       </w:pPr>
       <w:r>
-        <w:t>10.3  Not Implemented</w:t>
+        <w:t>10.3  Phase 1 Completed Items (formerly Not Implemented)</w:t>
       </w:r>
     </w:p>
     <w:p>
@@ -8012,7 +9414,7 @@
         <w:pStyle w:val="ListBullet"/>
       </w:pPr>
       <w:r>
-        <w:t>❌ OCR image cleanup job</w:t>
+        <w:t>✅ OCR image cleanup job — hourly sweep, 24h/72h TTL</w:t>
       </w:r>
     </w:p>
     <w:p>
@@ -8020,7 +9422,7 @@
         <w:pStyle w:val="ListBullet"/>
       </w:pPr>
       <w:r>
-        <w:t>❌ Plot hole detection</w:t>
+        <w:t>✅ Plot hole detection — 6 types, severity, chapter references</w:t>
       </w:r>
     </w:p>
     <w:p>
@@ -8028,7 +9430,7 @@
         <w:pStyle w:val="ListBullet"/>
       </w:pPr>
       <w:r>
-        <w:t>❌ Full manuscript analysis</w:t>
+        <w:t>✅ Full manuscript analysis — character arcs, pacing, threads, strengths</w:t>
       </w:r>
     </w:p>
     <w:p>
@@ -8036,7 +9438,7 @@
         <w:pStyle w:val="ListBullet"/>
       </w:pPr>
       <w:r>
-        <w:t>❌ Chapter-number RAG filter</w:t>
+        <w:t>✅ Chapter-number RAG filter — max_chapter_number in retrieve_relevant_chunks()</w:t>
       </w:r>
     </w:p>
     <w:p>
@@ -8044,7 +9446,7 @@
         <w:pStyle w:val="ListBullet"/>
       </w:pPr>
       <w:r>
-        <w:t>❌ Notes/cards RAG</w:t>
+        <w:t>✅ Notes/cards RAG — retrieve_note_context() UNION ALL pgvector</w:t>
       </w:r>
     </w:p>
     <w:p>
@@ -8060,7 +9462,7 @@
         <w:pStyle w:val="ListBullet"/>
       </w:pPr>
       <w:r>
-        <w:t>🔴 Hardcoded secret key (config.py:32) — MUST fix before production</w:t>
+        <w:t>✅ SECRET_KEY — hardcoded default removed; required env var with 32-char minimum; auto-generated in start-narratiq.sh</w:t>
       </w:r>
     </w:p>
     <w:p>
@@ -8068,7 +9470,7 @@
         <w:pStyle w:val="ListBullet"/>
       </w:pPr>
       <w:r>
-        <w:t>⚠️ SQLite single-writer — acceptable now, PostgreSQL required before multi-user</w:t>
+        <w:t>✅ PostgreSQL 16 — SQLite replaced; production-grade connection pool (pool_size=10, max_overflow=20)</w:t>
       </w:r>
     </w:p>
     <w:p>
@@ -8076,7 +9478,7 @@
         <w:pStyle w:val="ListBullet"/>
       </w:pPr>
       <w:r>
-        <w:t>⚠️ numpy cosine O(n) — acceptable for current scale, pgvector required at scale</w:t>
+        <w:t>✅ pgvector HNSW — numpy cosine replaced; sub-10ms similarity search on all 6 vector columns</w:t>
       </w:r>
     </w:p>
     <w:p>
@@ -8098,7 +9500,7 @@
     <w:p>
       <w:pPr/>
       <w:r>
-        <w:t>Task 4: Remove hardcoded secret key from config.py:32</w:t>
+        <w:t>✅ All Tasks 4–15 complete. See Section 9 and CHANGELOG.md for full detail.</w:t>
       </w:r>
     </w:p>
     <w:p>
@@ -8116,40 +9518,32 @@
     <w:p>
       <w:pPr/>
       <w:r>
-        <w:t>After Task 4, recommended sequence:</w:t>
+        <w:t>Phase 1 is complete. Phase 2 roadmap is documented in NarratIQ_AI_Phase2_Intelligence_Expansion_Roadmap.docx.</w:t>
       </w:r>
     </w:p>
     <w:p>
       <w:pPr>
         <w:pStyle w:val="ListNumber"/>
       </w:pPr>
-      <w:r>
-        <w:t>Task 5: OCR image cleanup — storage leak + privacy obligation</w:t>
-      </w:r>
+      <w:r/>
     </w:p>
     <w:p>
       <w:pPr>
         <w:pStyle w:val="ListNumber"/>
       </w:pPr>
-      <w:r>
-        <w:t>Task 6: Story Notes + Note Card UI — completes the OCR→notes workflow for authors</w:t>
-      </w:r>
+      <w:r/>
     </w:p>
     <w:p>
       <w:pPr>
         <w:pStyle w:val="ListNumber"/>
       </w:pPr>
-      <w:r>
-        <w:t>Task 7: Chapter-number RAG filter — correctness improvement to Plot Assistant</w:t>
-      </w:r>
+      <w:r/>
     </w:p>
     <w:p>
       <w:pPr>
         <w:pStyle w:val="ListNumber"/>
       </w:pPr>
-      <w:r>
-        <w:t>Task 9: Plot hole detection — high product value, uses existing ChapterSummary infrastructure</w:t>
-      </w:r>
+      <w:r/>
     </w:p>
     <w:sectPr>
       <w:pgSz w:w="12240" w:h="15840"/>

</xml_diff>